<commit_message>
Say what clearing the Netlify form list does, and does not, undo
Emptying Netlify is safe - what has already been collected is remembered in
Review: Netlify id inside Submissions.xlsx, not in Netlify. Deleting a staged
row by hand is the unsafe one: it comes straight back on the next run while
the submission is still in Netlify, and is unrecoverable once it is not.

Co-Authored-By: Claude Opus 5 <noreply@anthropic.com>
</commit_message>
<xml_diff>
--- a/Handling submissions.docx
+++ b/Handling submissions.docx
@@ -507,6 +507,62 @@
       </w:r>
       <w:r>
         <w:t xml:space="preserve"> The organisation becomes an Agent row; the named lead, date and commitments have no home there - keep those with your signatory record.</w:t>
+      </w:r>
+    </w:p>
+    <w:p>
+      <w:pPr>
+        <w:pStyle w:val="ListBullet"/>
+      </w:pPr>
+      <w:r>
+        <w:rPr>
+          <w:b/>
+        </w:rPr>
+        <w:t>Clearing Netlify is safe; deleting a staged row is not.</w:t>
+      </w:r>
+      <w:r>
+        <w:t xml:space="preserve"> What has already been collected is remembered in </w:t>
+      </w:r>
+      <w:r>
+        <w:rPr>
+          <w:rFonts w:ascii="Consolas" w:hAnsi="Consolas"/>
+          <w:color w:val="0F4C63"/>
+          <w:sz w:val="19"/>
+        </w:rPr>
+        <w:t>Review: Netlify id</w:t>
+      </w:r>
+      <w:r>
+        <w:t xml:space="preserve"> inside </w:t>
+      </w:r>
+      <w:r>
+        <w:rPr>
+          <w:rFonts w:ascii="Consolas" w:hAnsi="Consolas"/>
+          <w:color w:val="0F4C63"/>
+          <w:sz w:val="19"/>
+        </w:rPr>
+        <w:t>draft/Submissions.xlsx</w:t>
+      </w:r>
+      <w:r>
+        <w:t xml:space="preserve">, so emptying the Netlify list changes nothing there and nothing comes back. But delete a row </w:t>
+      </w:r>
+      <w:r>
+        <w:rPr>
+          <w:i/>
+        </w:rPr>
+        <w:t>by hand</w:t>
+      </w:r>
+      <w:r>
+        <w:t xml:space="preserve"> while it is still in Netlify and the next run re-adds it - and once Netlify is cleared, </w:t>
+      </w:r>
+      <w:r>
+        <w:rPr>
+          <w:rFonts w:ascii="Consolas" w:hAnsi="Consolas"/>
+          <w:color w:val="0F4C63"/>
+          <w:sz w:val="19"/>
+        </w:rPr>
+        <w:t>draft/Submissions.xlsx</w:t>
+      </w:r>
+      <w:r>
+        <w:t xml:space="preserve"> is the only copy left.</w:t>
       </w:r>
     </w:p>
     <w:p>

</xml_diff>